<commit_message>
fix(nav): resolve navbar scroll spy highlight bug and update content
- Fix useScrollSpy tracking so active nav highlight continuously updates during scroll after clicking links
- Add scroll margin offset for hero section
- Update site data JSONs with updated CV, skills, experience, projects, and references
</commit_message>
<xml_diff>
--- a/public/Mikhaelin Ramsaroop - CV (Latest).docx
+++ b/public/Mikhaelin Ramsaroop - CV (Latest).docx
@@ -42,7 +42,7 @@
           <w:sz w:val="22"/>
           <w:szCs w:val="22"/>
         </w:rPr>
-        <w:t xml:space="preserve">  Technical Lead</w:t>
+        <w:t xml:space="preserve"> Technical Lead</w:t>
       </w:r>
     </w:p>
     <w:p>
@@ -106,7 +106,13 @@
         <w:spacing w:after="100"/>
       </w:pPr>
       <w:r>
-        <w:t>Senior software developer and technical lead with 5+ years building and architecting full-stack, cloud, and data engineering solutions across Python, .NET, and the Microsoft Azure / Power Platform ecosystem. Equally comfortable writing production code, designing system architecture, and leading delivery — recent work spans Microsoft Fabric pipelines, enterprise Power BI platforms, Terraform-driven Azure infrastructure, and CI/CD automation, alongside mentoring junior developers and owning solution design on high-priority client engagements. Looking for a senior development or technical leadership role where I can stay hands-on with code while helping shape how a team builds.</w:t>
+        <w:t xml:space="preserve">Senior software developer and technical lead with </w:t>
+      </w:r>
+      <w:r>
+        <w:t>7</w:t>
+      </w:r>
+      <w:r>
+        <w:t>+ years building and architecting full-stack, cloud, and data engineering solutions across Python, .NET, and the Microsoft Azure / Power Platform ecosystem. Equally comfortable writing production code, designing system architecture, and leading delivery — recent work spans Microsoft Fabric pipelines, enterprise Power BI platforms, Terraform-driven Azure infrastructure, and CI/CD automation, alongside mentoring junior developers and owning solution design on high-priority client engagements. Looking for a senior development or technical leadership role where I can stay hands-on with code while helping shape how a team builds.</w:t>
       </w:r>
     </w:p>
     <w:p>
@@ -203,13 +209,11 @@
         <w:t xml:space="preserve">Languages: </w:t>
       </w:r>
       <w:r>
-        <w:t xml:space="preserve">Python, C#, Java, SQL, Kotlin, TypeScript, JavaScript, Dart, C++, PHP, HTML/CSS, Power </w:t>
-      </w:r>
-      <w:proofErr w:type="spellStart"/>
-      <w:r>
-        <w:t>Fx</w:t>
-      </w:r>
-      <w:proofErr w:type="spellEnd"/>
+        <w:t>Python, C#, Java, SQL, Kotlin, TypeScript, JavaScript, Dart, C++, PHP, HTML/CSS, Power Fx</w:t>
+      </w:r>
+      <w:r>
+        <w:t>, Flutter</w:t>
+      </w:r>
     </w:p>
     <w:p>
       <w:pPr>
@@ -228,23 +232,10 @@
         <w:t xml:space="preserve">Data &amp; Analytics: </w:t>
       </w:r>
       <w:r>
-        <w:t xml:space="preserve">Power BI, DAX, M Query, </w:t>
-      </w:r>
-      <w:proofErr w:type="spellStart"/>
-      <w:r>
-        <w:t>PySpark</w:t>
-      </w:r>
-      <w:proofErr w:type="spellEnd"/>
-      <w:r>
-        <w:t xml:space="preserve">, Pandas, </w:t>
-      </w:r>
-      <w:proofErr w:type="spellStart"/>
-      <w:r>
-        <w:t>SQLAlchemy</w:t>
-      </w:r>
-      <w:proofErr w:type="spellEnd"/>
-      <w:r>
-        <w:t>, Databricks, Microsoft Fabric, Azure Synapse, Data Factory, Data Lake</w:t>
+        <w:t>Power BI, DAX, M Query, PySpark, Pandas, SQLAlchemy, Databricks, Microsoft Fabric, Azure Synapse, Data Factory, Data Lake</w:t>
+      </w:r>
+      <w:r>
+        <w:t>, YML, XML, JSON</w:t>
       </w:r>
     </w:p>
     <w:p>
@@ -264,15 +255,7 @@
         <w:t xml:space="preserve">Cloud &amp; Infrastructure: </w:t>
       </w:r>
       <w:r>
-        <w:t xml:space="preserve">Microsoft Azure, Google Cloud Platform, Firebase, </w:t>
-      </w:r>
-      <w:proofErr w:type="spellStart"/>
-      <w:r>
-        <w:t>Vercel</w:t>
-      </w:r>
-      <w:proofErr w:type="spellEnd"/>
-      <w:r>
-        <w:t>, Power Platform, Terraform</w:t>
+        <w:t>Microsoft Azure, Google Cloud Platform, Firebase, Vercel, Power Platform, Terraform</w:t>
       </w:r>
     </w:p>
     <w:p>
@@ -294,6 +277,9 @@
       <w:r>
         <w:t>Visual Studio, VS Code, Android Studio, SQL Server Management Studio, Docker, Git/GitHub, Azure DevOps, Postman, GitHub Copilot</w:t>
       </w:r>
+      <w:r>
+        <w:t>, Factory AI, Claude Code, Antigravity</w:t>
+      </w:r>
     </w:p>
     <w:p>
       <w:pPr>
@@ -312,7 +298,13 @@
         <w:t xml:space="preserve">Architecture &amp; Delivery: </w:t>
       </w:r>
       <w:r>
-        <w:t>Solution scoping, system flow design, BRD/SDD documentation, timeline and stakeholder management</w:t>
+        <w:t>Solution scoping, system flow design</w:t>
+      </w:r>
+      <w:r>
+        <w:t>, tech stack implementation</w:t>
+      </w:r>
+      <w:r>
+        <w:t>, BRD/SDD documentation, timeline and stakeholder management</w:t>
       </w:r>
     </w:p>
     <w:p>
@@ -650,6 +642,45 @@
     </w:p>
     <w:p>
       <w:pPr>
+        <w:pStyle w:val="ListParagraph"/>
+        <w:numPr>
+          <w:ilvl w:val="0"/>
+          <w:numId w:val="2"/>
+        </w:numPr>
+        <w:spacing w:after="80"/>
+      </w:pPr>
+      <w:r>
+        <w:t>Managed monthly sentiment analysis reviews and generation of AI insights on the feedback received</w:t>
+      </w:r>
+    </w:p>
+    <w:p>
+      <w:pPr>
+        <w:pStyle w:val="ListParagraph"/>
+        <w:numPr>
+          <w:ilvl w:val="0"/>
+          <w:numId w:val="2"/>
+        </w:numPr>
+        <w:spacing w:after="80"/>
+      </w:pPr>
+      <w:r>
+        <w:t>Created Databricks pipelines to automate financial data ETL processes to build niche dashboards for executives.</w:t>
+      </w:r>
+    </w:p>
+    <w:p>
+      <w:pPr>
+        <w:pStyle w:val="ListParagraph"/>
+        <w:numPr>
+          <w:ilvl w:val="0"/>
+          <w:numId w:val="2"/>
+        </w:numPr>
+        <w:spacing w:after="80"/>
+      </w:pPr>
+      <w:r>
+        <w:t>Built and Automated a custom end to end solution for a Contracts Register Repository.</w:t>
+      </w:r>
+    </w:p>
+    <w:p>
+      <w:pPr>
         <w:spacing w:before="200" w:after="20"/>
       </w:pPr>
       <w:r>
@@ -706,20 +737,35 @@
         <w:spacing w:after="80"/>
       </w:pPr>
       <w:r>
-        <w:t>Developed and maintained Power BI dashboards using M Query.</w:t>
-      </w:r>
-    </w:p>
-    <w:p>
-      <w:pPr>
-        <w:pStyle w:val="ListParagraph"/>
-        <w:numPr>
-          <w:ilvl w:val="0"/>
-          <w:numId w:val="2"/>
-        </w:numPr>
-        <w:spacing w:after="80"/>
-      </w:pPr>
-      <w:r>
-        <w:t>Automated business processes through Power Apps and Power Automate.</w:t>
+        <w:t xml:space="preserve">Developed and maintained Power BI dashboards </w:t>
+      </w:r>
+      <w:r>
+        <w:t>for the business, aiding in generating usage metrics across multiple solutions</w:t>
+      </w:r>
+      <w:r>
+        <w:t>.</w:t>
+      </w:r>
+    </w:p>
+    <w:p>
+      <w:pPr>
+        <w:pStyle w:val="ListParagraph"/>
+        <w:numPr>
+          <w:ilvl w:val="0"/>
+          <w:numId w:val="2"/>
+        </w:numPr>
+        <w:spacing w:after="80"/>
+      </w:pPr>
+      <w:r>
+        <w:t>Automated business processes through Power Apps and Power Automate</w:t>
+      </w:r>
+      <w:r>
+        <w:t xml:space="preserve"> </w:t>
+      </w:r>
+      <w:r>
+        <w:t>application and workflow deployments</w:t>
+      </w:r>
+      <w:r>
+        <w:t>.</w:t>
       </w:r>
     </w:p>
     <w:p>
@@ -746,6 +792,58 @@
       </w:pPr>
       <w:r>
         <w:t>Contributed to business analysis documentation (BRD, SDD) and timeline management.</w:t>
+      </w:r>
+    </w:p>
+    <w:p>
+      <w:pPr>
+        <w:pStyle w:val="ListParagraph"/>
+        <w:numPr>
+          <w:ilvl w:val="0"/>
+          <w:numId w:val="2"/>
+        </w:numPr>
+        <w:spacing w:after="80"/>
+      </w:pPr>
+      <w:r>
+        <w:t>Created python applications that assisted with automation and popularization of pdf forms</w:t>
+      </w:r>
+    </w:p>
+    <w:p>
+      <w:pPr>
+        <w:pStyle w:val="ListParagraph"/>
+        <w:numPr>
+          <w:ilvl w:val="0"/>
+          <w:numId w:val="2"/>
+        </w:numPr>
+        <w:spacing w:after="80"/>
+      </w:pPr>
+      <w:r>
+        <w:t>Created python workflow applications that automated end to end processes for niche business requirements and applications.</w:t>
+      </w:r>
+    </w:p>
+    <w:p>
+      <w:pPr>
+        <w:pStyle w:val="ListParagraph"/>
+        <w:numPr>
+          <w:ilvl w:val="0"/>
+          <w:numId w:val="2"/>
+        </w:numPr>
+        <w:spacing w:after="80"/>
+      </w:pPr>
+      <w:r>
+        <w:t>Manged SharePoint sites, permissions and other ad-hoc tasks.</w:t>
+      </w:r>
+    </w:p>
+    <w:p>
+      <w:pPr>
+        <w:pStyle w:val="ListParagraph"/>
+        <w:numPr>
+          <w:ilvl w:val="0"/>
+          <w:numId w:val="2"/>
+        </w:numPr>
+        <w:spacing w:after="80"/>
+      </w:pPr>
+      <w:r>
+        <w:t>Contributed to team growth and collaboration.</w:t>
       </w:r>
     </w:p>
     <w:p>
@@ -806,46 +904,134 @@
         <w:spacing w:after="80"/>
       </w:pPr>
       <w:r>
-        <w:t>Developed web applications using ASP.NET and C#.</w:t>
-      </w:r>
-    </w:p>
-    <w:p>
-      <w:pPr>
-        <w:pStyle w:val="ListParagraph"/>
-        <w:numPr>
-          <w:ilvl w:val="0"/>
-          <w:numId w:val="2"/>
-        </w:numPr>
-        <w:spacing w:after="80"/>
-      </w:pPr>
-      <w:r>
-        <w:t>Supported and maintained Android applications built with Kotlin.</w:t>
-      </w:r>
-    </w:p>
-    <w:p>
-      <w:pPr>
-        <w:pStyle w:val="ListParagraph"/>
-        <w:numPr>
-          <w:ilvl w:val="0"/>
-          <w:numId w:val="2"/>
-        </w:numPr>
-        <w:spacing w:after="80"/>
-      </w:pPr>
-      <w:r>
-        <w:t>Managed database solutions on Microsoft SQL Server.</w:t>
-      </w:r>
-    </w:p>
-    <w:p>
-      <w:pPr>
-        <w:pStyle w:val="ListParagraph"/>
-        <w:numPr>
-          <w:ilvl w:val="0"/>
-          <w:numId w:val="2"/>
-        </w:numPr>
-        <w:spacing w:after="80"/>
-      </w:pPr>
-      <w:r>
-        <w:t>Provided application support and worked on Swagger API controllers.</w:t>
+        <w:t>Developed</w:t>
+      </w:r>
+      <w:r>
+        <w:t xml:space="preserve"> and maintained</w:t>
+      </w:r>
+      <w:r>
+        <w:t xml:space="preserve"> web applications using ASP.NET</w:t>
+      </w:r>
+      <w:r>
+        <w:t>, Blazor</w:t>
+      </w:r>
+      <w:r>
+        <w:t xml:space="preserve"> and C#.</w:t>
+      </w:r>
+    </w:p>
+    <w:p>
+      <w:pPr>
+        <w:pStyle w:val="ListParagraph"/>
+        <w:numPr>
+          <w:ilvl w:val="0"/>
+          <w:numId w:val="2"/>
+        </w:numPr>
+        <w:spacing w:after="80"/>
+      </w:pPr>
+      <w:r>
+        <w:t>Developed and maintained mobile applications using Kotlin and Flutter</w:t>
+      </w:r>
+      <w:r>
+        <w:t>.</w:t>
+      </w:r>
+    </w:p>
+    <w:p>
+      <w:pPr>
+        <w:pStyle w:val="ListParagraph"/>
+        <w:numPr>
+          <w:ilvl w:val="0"/>
+          <w:numId w:val="2"/>
+        </w:numPr>
+        <w:spacing w:after="80"/>
+      </w:pPr>
+      <w:r>
+        <w:t xml:space="preserve">Managed </w:t>
+      </w:r>
+      <w:r>
+        <w:t>Solution databases</w:t>
+      </w:r>
+      <w:r>
+        <w:t xml:space="preserve"> on Microsoft SQL Server</w:t>
+      </w:r>
+      <w:r>
+        <w:t>, including database migrations and upgrades</w:t>
+      </w:r>
+      <w:r>
+        <w:t>.</w:t>
+      </w:r>
+    </w:p>
+    <w:p>
+      <w:pPr>
+        <w:pStyle w:val="ListParagraph"/>
+        <w:numPr>
+          <w:ilvl w:val="0"/>
+          <w:numId w:val="2"/>
+        </w:numPr>
+        <w:spacing w:after="80"/>
+      </w:pPr>
+      <w:r>
+        <w:t>Created and maintained API’s using Swagger and C#</w:t>
+      </w:r>
+      <w:r>
+        <w:t>.</w:t>
+      </w:r>
+    </w:p>
+    <w:p>
+      <w:pPr>
+        <w:pStyle w:val="ListParagraph"/>
+        <w:numPr>
+          <w:ilvl w:val="0"/>
+          <w:numId w:val="2"/>
+        </w:numPr>
+        <w:spacing w:after="80"/>
+      </w:pPr>
+      <w:r>
+        <w:t xml:space="preserve">Managed </w:t>
+      </w:r>
+      <w:r>
+        <w:t>server-based</w:t>
+      </w:r>
+      <w:r>
+        <w:t xml:space="preserve"> application deployments and web application updates</w:t>
+      </w:r>
+    </w:p>
+    <w:p>
+      <w:pPr>
+        <w:pStyle w:val="ListParagraph"/>
+        <w:numPr>
+          <w:ilvl w:val="0"/>
+          <w:numId w:val="2"/>
+        </w:numPr>
+        <w:spacing w:after="80"/>
+      </w:pPr>
+      <w:r>
+        <w:t>Developed Desktop applications that worked alongside web applications and other systems.</w:t>
+      </w:r>
+    </w:p>
+    <w:p>
+      <w:pPr>
+        <w:pStyle w:val="ListParagraph"/>
+        <w:numPr>
+          <w:ilvl w:val="0"/>
+          <w:numId w:val="2"/>
+        </w:numPr>
+        <w:spacing w:after="80"/>
+      </w:pPr>
+      <w:r>
+        <w:t>Integrated Figma designs into mobile applications.</w:t>
+      </w:r>
+    </w:p>
+    <w:p>
+      <w:pPr>
+        <w:pStyle w:val="ListParagraph"/>
+        <w:numPr>
+          <w:ilvl w:val="0"/>
+          <w:numId w:val="2"/>
+        </w:numPr>
+        <w:spacing w:after="80"/>
+      </w:pPr>
+      <w:r>
+        <w:t>Managed/Assisted with Mobile application deployment to app stores</w:t>
       </w:r>
     </w:p>
     <w:p>
@@ -919,6 +1105,7 @@
         <w:spacing w:after="80"/>
       </w:pPr>
       <w:r>
+        <w:lastRenderedPageBreak/>
         <w:t>Managed SharePoint libraries, access control, and Qlik access.</w:t>
       </w:r>
     </w:p>
@@ -933,6 +1120,32 @@
       </w:pPr>
       <w:r>
         <w:t>Assisted in maintaining the company’s data warehouse.</w:t>
+      </w:r>
+    </w:p>
+    <w:p>
+      <w:pPr>
+        <w:pStyle w:val="ListParagraph"/>
+        <w:numPr>
+          <w:ilvl w:val="0"/>
+          <w:numId w:val="2"/>
+        </w:numPr>
+        <w:spacing w:after="80"/>
+      </w:pPr>
+      <w:r>
+        <w:t>Power Apps &amp; Power Automate Development and support.</w:t>
+      </w:r>
+    </w:p>
+    <w:p>
+      <w:pPr>
+        <w:pStyle w:val="ListParagraph"/>
+        <w:numPr>
+          <w:ilvl w:val="0"/>
+          <w:numId w:val="2"/>
+        </w:numPr>
+        <w:spacing w:after="80"/>
+      </w:pPr>
+      <w:r>
+        <w:t>Created business centric tools.</w:t>
       </w:r>
     </w:p>
     <w:p>
@@ -1140,7 +1353,6 @@
         <w:spacing w:after="80"/>
       </w:pPr>
       <w:r>
-        <w:lastRenderedPageBreak/>
         <w:t>Microsoft Certified: Fabric Analytics Engineer</w:t>
       </w:r>
     </w:p>
@@ -1224,21 +1436,12 @@
       <w:pPr>
         <w:spacing w:after="40"/>
       </w:pPr>
-      <w:proofErr w:type="spellStart"/>
-      <w:r>
-        <w:rPr>
-          <w:b/>
-          <w:bCs/>
-        </w:rPr>
-        <w:t>Keroshen</w:t>
-      </w:r>
-      <w:proofErr w:type="spellEnd"/>
-      <w:r>
-        <w:rPr>
-          <w:b/>
-          <w:bCs/>
-        </w:rPr>
-        <w:t xml:space="preserve"> </w:t>
+      <w:r>
+        <w:rPr>
+          <w:b/>
+          <w:bCs/>
+        </w:rPr>
+        <w:t xml:space="preserve">Keroshen </w:t>
       </w:r>
       <w:r>
         <w:rPr>
@@ -1263,19 +1466,7 @@
         <w:rPr>
           <w:color w:val="595959"/>
         </w:rPr>
-        <w:t xml:space="preserve"> </w:t>
-      </w:r>
-      <w:r>
-        <w:rPr>
-          <w:color w:val="595959"/>
-        </w:rPr>
-        <w:t xml:space="preserve">| </w:t>
-      </w:r>
-      <w:r>
-        <w:rPr>
-          <w:color w:val="595959"/>
-        </w:rPr>
-        <w:t>081 308 0545</w:t>
+        <w:t xml:space="preserve"> | 081 308 0545</w:t>
       </w:r>
     </w:p>
     <w:p>
@@ -1289,7 +1480,6 @@
         </w:rPr>
         <w:t xml:space="preserve">Zenobia </w:t>
       </w:r>
-      <w:proofErr w:type="spellStart"/>
       <w:r>
         <w:rPr>
           <w:b/>
@@ -1297,7 +1487,6 @@
         </w:rPr>
         <w:t>Katts</w:t>
       </w:r>
-      <w:proofErr w:type="spellEnd"/>
       <w:r>
         <w:rPr>
           <w:color w:val="595959"/>
@@ -1357,19 +1546,7 @@
         <w:rPr>
           <w:color w:val="595959"/>
         </w:rPr>
-        <w:t xml:space="preserve"> </w:t>
-      </w:r>
-      <w:r>
-        <w:rPr>
-          <w:color w:val="595959"/>
-        </w:rPr>
-        <w:t xml:space="preserve">| </w:t>
-      </w:r>
-      <w:r>
-        <w:rPr>
-          <w:color w:val="595959"/>
-        </w:rPr>
-        <w:t>084 523 4786</w:t>
+        <w:t xml:space="preserve"> | 084 523 4786</w:t>
       </w:r>
     </w:p>
     <w:p>
@@ -1383,7 +1560,6 @@
         </w:rPr>
         <w:t xml:space="preserve">Vinesh </w:t>
       </w:r>
-      <w:proofErr w:type="spellStart"/>
       <w:r>
         <w:rPr>
           <w:b/>
@@ -1391,7 +1567,6 @@
         </w:rPr>
         <w:t>Gramny</w:t>
       </w:r>
-      <w:proofErr w:type="spellEnd"/>
       <w:r>
         <w:rPr>
           <w:color w:val="595959"/>
@@ -1451,19 +1626,7 @@
         <w:rPr>
           <w:color w:val="595959"/>
         </w:rPr>
-        <w:t xml:space="preserve"> </w:t>
-      </w:r>
-      <w:r>
-        <w:rPr>
-          <w:color w:val="595959"/>
-        </w:rPr>
-        <w:t xml:space="preserve">| </w:t>
-      </w:r>
-      <w:r>
-        <w:rPr>
-          <w:color w:val="595959"/>
-        </w:rPr>
-        <w:t>073 318 4809</w:t>
+        <w:t xml:space="preserve"> | 073 318 4809</w:t>
       </w:r>
     </w:p>
     <w:sectPr>

</xml_diff>

<commit_message>
chore: commit workspace changes
</commit_message>
<xml_diff>
--- a/public/Mikhaelin Ramsaroop - CV (Latest).docx
+++ b/public/Mikhaelin Ramsaroop - CV (Latest).docx
@@ -82,7 +82,7 @@
           <w:sz w:val="19"/>
           <w:szCs w:val="19"/>
         </w:rPr>
-        <w:t xml:space="preserve">   •   </w:t>
+        <w:t xml:space="preserve">   •  </w:t>
       </w:r>
       <w:r>
         <w:rPr>
@@ -90,7 +90,7 @@
           <w:sz w:val="19"/>
           <w:szCs w:val="19"/>
         </w:rPr>
-        <w:t>Pinetown, KwaZulu-Natal</w:t>
+        <w:t>KwaZulu-Natal</w:t>
       </w:r>
     </w:p>
     <w:p>
@@ -929,7 +929,29 @@
         <w:spacing w:after="80"/>
       </w:pPr>
       <w:r>
-        <w:t>Developed and maintained mobile applications using Kotlin and Flutter</w:t>
+        <w:t>Developed and maintained mobile applications using Kotlin and Flutter.</w:t>
+      </w:r>
+    </w:p>
+    <w:p>
+      <w:pPr>
+        <w:pStyle w:val="ListParagraph"/>
+        <w:numPr>
+          <w:ilvl w:val="0"/>
+          <w:numId w:val="2"/>
+        </w:numPr>
+        <w:spacing w:after="80"/>
+      </w:pPr>
+      <w:r>
+        <w:t xml:space="preserve">Managed </w:t>
+      </w:r>
+      <w:r>
+        <w:t>Solution databases</w:t>
+      </w:r>
+      <w:r>
+        <w:t xml:space="preserve"> on Microsoft SQL Server</w:t>
+      </w:r>
+      <w:r>
+        <w:t>, including database migrations and upgrades</w:t>
       </w:r>
       <w:r>
         <w:t>.</w:t>
@@ -945,35 +967,7 @@
         <w:spacing w:after="80"/>
       </w:pPr>
       <w:r>
-        <w:t xml:space="preserve">Managed </w:t>
-      </w:r>
-      <w:r>
-        <w:t>Solution databases</w:t>
-      </w:r>
-      <w:r>
-        <w:t xml:space="preserve"> on Microsoft SQL Server</w:t>
-      </w:r>
-      <w:r>
-        <w:t>, including database migrations and upgrades</w:t>
-      </w:r>
-      <w:r>
-        <w:t>.</w:t>
-      </w:r>
-    </w:p>
-    <w:p>
-      <w:pPr>
-        <w:pStyle w:val="ListParagraph"/>
-        <w:numPr>
-          <w:ilvl w:val="0"/>
-          <w:numId w:val="2"/>
-        </w:numPr>
-        <w:spacing w:after="80"/>
-      </w:pPr>
-      <w:r>
-        <w:t>Created and maintained API’s using Swagger and C#</w:t>
-      </w:r>
-      <w:r>
-        <w:t>.</w:t>
+        <w:t>Created and maintained API’s using Swagger and C#.</w:t>
       </w:r>
     </w:p>
     <w:p>
@@ -1441,192 +1435,7 @@
           <w:b/>
           <w:bCs/>
         </w:rPr>
-        <w:t xml:space="preserve">Keroshen </w:t>
-      </w:r>
-      <w:r>
-        <w:rPr>
-          <w:b/>
-          <w:bCs/>
-        </w:rPr>
-        <w:t>Naidoo</w:t>
-      </w:r>
-      <w:r>
-        <w:rPr>
-          <w:color w:val="595959"/>
-        </w:rPr>
-        <w:t xml:space="preserve"> — Africa</w:t>
-      </w:r>
-      <w:r>
-        <w:rPr>
-          <w:color w:val="595959"/>
-        </w:rPr>
-        <w:t xml:space="preserve"> Automation Leader, EY</w:t>
-      </w:r>
-      <w:r>
-        <w:rPr>
-          <w:color w:val="595959"/>
-        </w:rPr>
-        <w:t xml:space="preserve"> | 081 308 0545</w:t>
-      </w:r>
-    </w:p>
-    <w:p>
-      <w:pPr>
-        <w:spacing w:after="40"/>
-      </w:pPr>
-      <w:r>
-        <w:rPr>
-          <w:b/>
-          <w:bCs/>
-        </w:rPr>
-        <w:t xml:space="preserve">Zenobia </w:t>
-      </w:r>
-      <w:r>
-        <w:rPr>
-          <w:b/>
-          <w:bCs/>
-        </w:rPr>
-        <w:t>Katts</w:t>
-      </w:r>
-      <w:r>
-        <w:rPr>
-          <w:color w:val="595959"/>
-        </w:rPr>
-        <w:t xml:space="preserve"> — IT</w:t>
-      </w:r>
-      <w:r>
-        <w:rPr>
-          <w:color w:val="595959"/>
-        </w:rPr>
-        <w:t xml:space="preserve"> Project Manager, </w:t>
-      </w:r>
-      <w:r>
-        <w:rPr>
-          <w:color w:val="595959"/>
-        </w:rPr>
-        <w:t>Tsebo | 066</w:t>
-      </w:r>
-      <w:r>
-        <w:rPr>
-          <w:color w:val="595959"/>
-        </w:rPr>
-        <w:t xml:space="preserve"> 484 4107</w:t>
-      </w:r>
-    </w:p>
-    <w:p>
-      <w:pPr>
-        <w:spacing w:after="40"/>
-      </w:pPr>
-      <w:r>
-        <w:rPr>
-          <w:b/>
-          <w:bCs/>
-        </w:rPr>
-        <w:t xml:space="preserve">Imraan </w:t>
-      </w:r>
-      <w:r>
-        <w:rPr>
-          <w:b/>
-          <w:bCs/>
-        </w:rPr>
-        <w:t>Rahim</w:t>
-      </w:r>
-      <w:r>
-        <w:rPr>
-          <w:color w:val="595959"/>
-        </w:rPr>
-        <w:t xml:space="preserve"> — Custom</w:t>
-      </w:r>
-      <w:r>
-        <w:rPr>
-          <w:color w:val="595959"/>
-        </w:rPr>
-        <w:t xml:space="preserve"> Analytics Leader, EY</w:t>
-      </w:r>
-      <w:r>
-        <w:rPr>
-          <w:color w:val="595959"/>
-        </w:rPr>
-        <w:t xml:space="preserve"> | 084 523 4786</w:t>
-      </w:r>
-    </w:p>
-    <w:p>
-      <w:pPr>
-        <w:spacing w:after="40"/>
-      </w:pPr>
-      <w:r>
-        <w:rPr>
-          <w:b/>
-          <w:bCs/>
-        </w:rPr>
-        <w:t xml:space="preserve">Vinesh </w:t>
-      </w:r>
-      <w:r>
-        <w:rPr>
-          <w:b/>
-          <w:bCs/>
-        </w:rPr>
-        <w:t>Gramny</w:t>
-      </w:r>
-      <w:r>
-        <w:rPr>
-          <w:color w:val="595959"/>
-        </w:rPr>
-        <w:t xml:space="preserve"> — CIO</w:t>
-      </w:r>
-      <w:r>
-        <w:rPr>
-          <w:color w:val="595959"/>
-        </w:rPr>
-        <w:t xml:space="preserve">, </w:t>
-      </w:r>
-      <w:r>
-        <w:rPr>
-          <w:color w:val="595959"/>
-        </w:rPr>
-        <w:t>Tsebo | 082</w:t>
-      </w:r>
-      <w:r>
-        <w:rPr>
-          <w:color w:val="595959"/>
-        </w:rPr>
-        <w:t xml:space="preserve"> 462 7047</w:t>
-      </w:r>
-    </w:p>
-    <w:p>
-      <w:pPr>
-        <w:spacing w:after="40"/>
-      </w:pPr>
-      <w:r>
-        <w:rPr>
-          <w:b/>
-          <w:bCs/>
-        </w:rPr>
-        <w:t xml:space="preserve">Joshua </w:t>
-      </w:r>
-      <w:r>
-        <w:rPr>
-          <w:b/>
-          <w:bCs/>
-        </w:rPr>
-        <w:t>Constance</w:t>
-      </w:r>
-      <w:r>
-        <w:rPr>
-          <w:color w:val="595959"/>
-        </w:rPr>
-        <w:t xml:space="preserve"> — Data</w:t>
-      </w:r>
-      <w:r>
-        <w:rPr>
-          <w:color w:val="595959"/>
-        </w:rPr>
-        <w:t xml:space="preserve"> Engineer, Tsebo</w:t>
-      </w:r>
-      <w:r>
-        <w:rPr>
-          <w:color w:val="595959"/>
-        </w:rPr>
-        <w:t xml:space="preserve"> | 073 318 4809</w:t>
+        <w:t>(Please contact me for information)</w:t>
       </w:r>
     </w:p>
     <w:sectPr>

</xml_diff>